<commit_message>
generic commit so others can work
</commit_message>
<xml_diff>
--- a/BHB Capstone Proposal Revision.docx
+++ b/BHB Capstone Proposal Revision.docx
@@ -14,7 +14,6 @@
           <w:docPartUnique/>
         </w:docPartObj>
       </w:sdtPr>
-      <w:sdtEndPr/>
       <w:sdtContent>
         <w:p>
           <w:pPr>
@@ -7116,7 +7115,6 @@
           <w:id w:val="1341508552"/>
           <w:citation/>
         </w:sdtPr>
-        <w:sdtEndPr/>
         <w:sdtContent>
           <w:r>
             <w:fldChar w:fldCharType="begin"/>
@@ -7326,7 +7324,6 @@
           <w:id w:val="-1809770849"/>
           <w:citation/>
         </w:sdtPr>
-        <w:sdtEndPr/>
         <w:sdtContent>
           <w:r>
             <w:rPr>
@@ -7450,7 +7447,6 @@
           <w:id w:val="-1792119850"/>
           <w:citation/>
         </w:sdtPr>
-        <w:sdtEndPr/>
         <w:sdtContent>
           <w:r>
             <w:rPr>
@@ -7555,7 +7551,6 @@
           <w:id w:val="-1548904849"/>
           <w:citation/>
         </w:sdtPr>
-        <w:sdtEndPr/>
         <w:sdtContent>
           <w:r>
             <w:rPr>
@@ -7653,7 +7648,6 @@
           <w:id w:val="332106985"/>
           <w:citation/>
         </w:sdtPr>
-        <w:sdtEndPr/>
         <w:sdtContent>
           <w:r>
             <w:rPr>
@@ -8060,7 +8054,6 @@
           <w:id w:val="1397781156"/>
           <w:citation/>
         </w:sdtPr>
-        <w:sdtEndPr/>
         <w:sdtContent>
           <w:r>
             <w:fldChar w:fldCharType="begin"/>
@@ -8230,7 +8223,6 @@
           <w:id w:val="-1745091917"/>
           <w:citation/>
         </w:sdtPr>
-        <w:sdtEndPr/>
         <w:sdtContent>
           <w:r>
             <w:fldChar w:fldCharType="begin"/>
@@ -11271,6 +11263,19 @@
     </w:p>
     <w:p>
       <w:pPr>
+        <w:rPr>
+          <w:lang w:val="en-NZ"/>
+        </w:rPr>
+      </w:pPr>
+      <w:r>
+        <w:rPr>
+          <w:lang w:val="en-NZ"/>
+        </w:rPr>
+        <w:t>Table 1 – Group members on page 12 displays the members of the group working on the project.</w:t>
+      </w:r>
+    </w:p>
+    <w:p>
+      <w:pPr>
         <w:pStyle w:val="Caption"/>
         <w:keepNext/>
       </w:pPr>
@@ -12074,11 +12079,7 @@
         <w:pStyle w:val="TNR"/>
       </w:pPr>
     </w:p>
-    <w:p>
-      <w:pPr>
-        <w:pStyle w:val="TNR"/>
-      </w:pPr>
-    </w:p>
+    <w:p/>
     <w:p>
       <w:pPr>
         <w:pStyle w:val="Heading2"/>
@@ -13224,13 +13225,14 @@
         <w:tblLook w:val="04A0" w:firstRow="1" w:lastRow="0" w:firstColumn="1" w:lastColumn="0" w:noHBand="0" w:noVBand="1"/>
       </w:tblPr>
       <w:tblGrid>
-        <w:gridCol w:w="4508"/>
-        <w:gridCol w:w="4701"/>
+        <w:gridCol w:w="3397"/>
+        <w:gridCol w:w="2972"/>
+        <w:gridCol w:w="4087"/>
       </w:tblGrid>
       <w:tr>
         <w:tc>
           <w:tcPr>
-            <w:tcW w:w="4508" w:type="dxa"/>
+            <w:tcW w:w="3397" w:type="dxa"/>
           </w:tcPr>
           <w:p>
             <w:pPr>
@@ -13251,7 +13253,7 @@
         </w:tc>
         <w:tc>
           <w:tcPr>
-            <w:tcW w:w="4701" w:type="dxa"/>
+            <w:tcW w:w="2972" w:type="dxa"/>
           </w:tcPr>
           <w:p>
             <w:pPr>
@@ -13270,12 +13272,33 @@
             </w:r>
           </w:p>
         </w:tc>
+        <w:tc>
+          <w:tcPr>
+            <w:tcW w:w="4087" w:type="dxa"/>
+          </w:tcPr>
+          <w:p>
+            <w:pPr>
+              <w:pStyle w:val="TNR"/>
+              <w:rPr>
+                <w:b/>
+                <w:bCs/>
+              </w:rPr>
+            </w:pPr>
+            <w:r>
+              <w:rPr>
+                <w:b/>
+                <w:bCs/>
+              </w:rPr>
+              <w:t>Requirement Type</w:t>
+            </w:r>
+          </w:p>
+        </w:tc>
       </w:tr>
       <w:tr>
         <w:tc>
           <w:tcPr>
-            <w:tcW w:w="4508" w:type="dxa"/>
-            <w:shd w:val="clear" w:color="auto" w:fill="F6C5AC" w:themeFill="accent2" w:themeFillTint="66"/>
+            <w:tcW w:w="3397" w:type="dxa"/>
+            <w:shd w:val="clear" w:color="auto" w:fill="FFFFFF" w:themeFill="background1"/>
           </w:tcPr>
           <w:p>
             <w:pPr>
@@ -13285,14 +13308,14 @@
               <w:rPr>
                 <w:rFonts w:cs="Arial"/>
               </w:rPr>
-              <w:t>Proposal due (academic)</w:t>
-            </w:r>
-          </w:p>
-        </w:tc>
-        <w:tc>
-          <w:tcPr>
-            <w:tcW w:w="4701" w:type="dxa"/>
-            <w:shd w:val="clear" w:color="auto" w:fill="F6C5AC" w:themeFill="accent2" w:themeFillTint="66"/>
+              <w:t>Written Project Proposal</w:t>
+            </w:r>
+          </w:p>
+        </w:tc>
+        <w:tc>
+          <w:tcPr>
+            <w:tcW w:w="2972" w:type="dxa"/>
+            <w:shd w:val="clear" w:color="auto" w:fill="FFFFFF" w:themeFill="background1"/>
           </w:tcPr>
           <w:p>
             <w:pPr>
@@ -13303,6 +13326,26 @@
                 <w:rFonts w:cs="Arial"/>
               </w:rPr>
               <w:t>Week 4</w:t>
+            </w:r>
+          </w:p>
+        </w:tc>
+        <w:tc>
+          <w:tcPr>
+            <w:tcW w:w="4087" w:type="dxa"/>
+            <w:shd w:val="clear" w:color="auto" w:fill="C1E4F5" w:themeFill="accent1" w:themeFillTint="33"/>
+          </w:tcPr>
+          <w:p>
+            <w:pPr>
+              <w:pStyle w:val="TNR"/>
+              <w:rPr>
+                <w:rFonts w:cs="Arial"/>
+              </w:rPr>
+            </w:pPr>
+            <w:r>
+              <w:rPr>
+                <w:rFonts w:cs="Arial"/>
+              </w:rPr>
+              <w:t>Academic</w:t>
             </w:r>
           </w:p>
         </w:tc>
@@ -13310,7 +13353,47 @@
       <w:tr>
         <w:tc>
           <w:tcPr>
-            <w:tcW w:w="4508" w:type="dxa"/>
+            <w:tcW w:w="3397" w:type="dxa"/>
+            <w:shd w:val="clear" w:color="auto" w:fill="FFFFFF" w:themeFill="background1"/>
+          </w:tcPr>
+          <w:p>
+            <w:pPr>
+              <w:pStyle w:val="TNR"/>
+              <w:rPr>
+                <w:rFonts w:cs="Arial"/>
+              </w:rPr>
+            </w:pPr>
+            <w:r>
+              <w:rPr>
+                <w:rFonts w:cs="Arial"/>
+              </w:rPr>
+              <w:t>Final version of Proposal</w:t>
+            </w:r>
+          </w:p>
+        </w:tc>
+        <w:tc>
+          <w:tcPr>
+            <w:tcW w:w="2972" w:type="dxa"/>
+            <w:shd w:val="clear" w:color="auto" w:fill="FFFFFF" w:themeFill="background1"/>
+          </w:tcPr>
+          <w:p>
+            <w:pPr>
+              <w:pStyle w:val="TNR"/>
+              <w:rPr>
+                <w:rFonts w:cs="Arial"/>
+              </w:rPr>
+            </w:pPr>
+            <w:r>
+              <w:rPr>
+                <w:rFonts w:cs="Arial"/>
+              </w:rPr>
+              <w:t>Week 6</w:t>
+            </w:r>
+          </w:p>
+        </w:tc>
+        <w:tc>
+          <w:tcPr>
+            <w:tcW w:w="4087" w:type="dxa"/>
             <w:shd w:val="clear" w:color="auto" w:fill="C1E4F5" w:themeFill="accent1" w:themeFillTint="33"/>
           </w:tcPr>
           <w:p>
@@ -13324,57 +13407,60 @@
               <w:rPr>
                 <w:rFonts w:cs="Arial"/>
               </w:rPr>
-              <w:t>Mid project proposal thing</w:t>
-            </w:r>
-          </w:p>
-        </w:tc>
-        <w:tc>
-          <w:tcPr>
-            <w:tcW w:w="4701" w:type="dxa"/>
-            <w:shd w:val="clear" w:color="auto" w:fill="C1E4F5" w:themeFill="accent1" w:themeFillTint="33"/>
-          </w:tcPr>
-          <w:p>
-            <w:pPr>
-              <w:pStyle w:val="TNR"/>
-              <w:rPr>
-                <w:rFonts w:cs="Arial"/>
-              </w:rPr>
-            </w:pPr>
+              <w:t>Academic</w:t>
+            </w:r>
           </w:p>
         </w:tc>
       </w:tr>
       <w:tr>
         <w:tc>
           <w:tcPr>
-            <w:tcW w:w="4508" w:type="dxa"/>
+            <w:tcW w:w="3397" w:type="dxa"/>
+            <w:shd w:val="clear" w:color="auto" w:fill="FFFFFF" w:themeFill="background1"/>
+          </w:tcPr>
+          <w:p>
+            <w:pPr>
+              <w:pStyle w:val="TNR"/>
+              <w:rPr>
+                <w:rFonts w:cs="Arial"/>
+              </w:rPr>
+            </w:pPr>
+            <w:r>
+              <w:rPr>
+                <w:rFonts w:cs="Arial"/>
+              </w:rPr>
+              <w:t>Video: Project proposal evidence of meeting</w:t>
+            </w:r>
+          </w:p>
+        </w:tc>
+        <w:tc>
+          <w:tcPr>
+            <w:tcW w:w="2972" w:type="dxa"/>
+            <w:shd w:val="clear" w:color="auto" w:fill="FFFFFF" w:themeFill="background1"/>
+          </w:tcPr>
+          <w:p>
+            <w:pPr>
+              <w:pStyle w:val="TNR"/>
+              <w:rPr>
+                <w:rFonts w:cs="Arial"/>
+              </w:rPr>
+            </w:pPr>
+            <w:r>
+              <w:rPr>
+                <w:rFonts w:cs="Arial"/>
+              </w:rPr>
+              <w:t>Week 4</w:t>
+            </w:r>
+          </w:p>
+        </w:tc>
+        <w:tc>
+          <w:tcPr>
+            <w:tcW w:w="4087" w:type="dxa"/>
             <w:shd w:val="clear" w:color="auto" w:fill="C1E4F5" w:themeFill="accent1" w:themeFillTint="33"/>
           </w:tcPr>
           <w:p>
-            <w:pPr>
-              <w:pStyle w:val="TNR"/>
-            </w:pPr>
-            <w:r>
-              <w:rPr>
-                <w:rFonts w:cs="Arial"/>
-              </w:rPr>
-              <w:t>Client Demo (client)</w:t>
-            </w:r>
-          </w:p>
-        </w:tc>
-        <w:tc>
-          <w:tcPr>
-            <w:tcW w:w="4701" w:type="dxa"/>
-            <w:shd w:val="clear" w:color="auto" w:fill="C1E4F5" w:themeFill="accent1" w:themeFillTint="33"/>
-          </w:tcPr>
-          <w:p>
-            <w:pPr>
-              <w:pStyle w:val="TNR"/>
-            </w:pPr>
-            <w:r>
-              <w:rPr>
-                <w:rFonts w:cs="Arial"/>
-              </w:rPr>
-              <w:t>Week 14</w:t>
+            <w:r>
+              <w:t>Academic</w:t>
             </w:r>
           </w:p>
         </w:tc>
@@ -13382,35 +13468,61 @@
       <w:tr>
         <w:tc>
           <w:tcPr>
-            <w:tcW w:w="4508" w:type="dxa"/>
-            <w:shd w:val="clear" w:color="auto" w:fill="F6C5AC" w:themeFill="accent2" w:themeFillTint="66"/>
+            <w:tcW w:w="3397" w:type="dxa"/>
+            <w:shd w:val="clear" w:color="auto" w:fill="FFFFFF" w:themeFill="background1"/>
           </w:tcPr>
           <w:p>
             <w:pPr>
               <w:pStyle w:val="TNR"/>
-            </w:pPr>
-            <w:r>
               <w:rPr>
                 <w:rFonts w:cs="Arial"/>
               </w:rPr>
-              <w:t>Final Panel (academic)</w:t>
-            </w:r>
-          </w:p>
-        </w:tc>
-        <w:tc>
-          <w:tcPr>
-            <w:tcW w:w="4701" w:type="dxa"/>
-            <w:shd w:val="clear" w:color="auto" w:fill="F6C5AC" w:themeFill="accent2" w:themeFillTint="66"/>
+            </w:pPr>
+            <w:r>
+              <w:rPr>
+                <w:rFonts w:cs="Arial"/>
+              </w:rPr>
+              <w:t>Self-management review</w:t>
+            </w:r>
+          </w:p>
+        </w:tc>
+        <w:tc>
+          <w:tcPr>
+            <w:tcW w:w="2972" w:type="dxa"/>
+            <w:shd w:val="clear" w:color="auto" w:fill="FFFFFF" w:themeFill="background1"/>
           </w:tcPr>
           <w:p>
             <w:pPr>
               <w:pStyle w:val="TNR"/>
-            </w:pPr>
-            <w:r>
               <w:rPr>
                 <w:rFonts w:cs="Arial"/>
               </w:rPr>
-              <w:t>Week 16 or 17</w:t>
+            </w:pPr>
+            <w:r>
+              <w:rPr>
+                <w:rFonts w:cs="Arial"/>
+              </w:rPr>
+              <w:t>Week 13</w:t>
+            </w:r>
+          </w:p>
+        </w:tc>
+        <w:tc>
+          <w:tcPr>
+            <w:tcW w:w="4087" w:type="dxa"/>
+            <w:shd w:val="clear" w:color="auto" w:fill="C1E4F5" w:themeFill="accent1" w:themeFillTint="33"/>
+          </w:tcPr>
+          <w:p>
+            <w:pPr>
+              <w:pStyle w:val="TNR"/>
+              <w:rPr>
+                <w:rFonts w:cs="Arial"/>
+              </w:rPr>
+            </w:pPr>
+            <w:r>
+              <w:rPr>
+                <w:rFonts w:cs="Arial"/>
+              </w:rPr>
+              <w:t>Academic</w:t>
             </w:r>
           </w:p>
         </w:tc>
@@ -13418,47 +13530,190 @@
       <w:tr>
         <w:tc>
           <w:tcPr>
-            <w:tcW w:w="4508" w:type="dxa"/>
+            <w:tcW w:w="3397" w:type="dxa"/>
+            <w:shd w:val="clear" w:color="auto" w:fill="FFFFFF" w:themeFill="background1"/>
           </w:tcPr>
           <w:p>
             <w:pPr>
               <w:pStyle w:val="TNR"/>
             </w:pPr>
-          </w:p>
-        </w:tc>
-        <w:tc>
-          <w:tcPr>
-            <w:tcW w:w="4701" w:type="dxa"/>
+            <w:r>
+              <w:rPr>
+                <w:rFonts w:cs="Arial"/>
+              </w:rPr>
+              <w:t>Client Demo</w:t>
+            </w:r>
+          </w:p>
+        </w:tc>
+        <w:tc>
+          <w:tcPr>
+            <w:tcW w:w="2972" w:type="dxa"/>
+            <w:shd w:val="clear" w:color="auto" w:fill="FFFFFF" w:themeFill="background1"/>
           </w:tcPr>
           <w:p>
             <w:pPr>
               <w:pStyle w:val="TNR"/>
             </w:pPr>
+            <w:r>
+              <w:rPr>
+                <w:rFonts w:cs="Arial"/>
+              </w:rPr>
+              <w:t>Week 14</w:t>
+            </w:r>
+          </w:p>
+        </w:tc>
+        <w:tc>
+          <w:tcPr>
+            <w:tcW w:w="4087" w:type="dxa"/>
+            <w:shd w:val="clear" w:color="auto" w:fill="F6C5AC" w:themeFill="accent2" w:themeFillTint="66"/>
+          </w:tcPr>
+          <w:p>
+            <w:pPr>
+              <w:pStyle w:val="TNR"/>
+              <w:rPr>
+                <w:rFonts w:cs="Arial"/>
+              </w:rPr>
+            </w:pPr>
+            <w:r>
+              <w:rPr>
+                <w:rFonts w:cs="Arial"/>
+              </w:rPr>
+              <w:t>Client</w:t>
+            </w:r>
           </w:p>
         </w:tc>
       </w:tr>
       <w:tr>
         <w:tc>
           <w:tcPr>
-            <w:tcW w:w="4508" w:type="dxa"/>
+            <w:tcW w:w="3397" w:type="dxa"/>
+            <w:shd w:val="clear" w:color="auto" w:fill="FFFFFF" w:themeFill="background1"/>
           </w:tcPr>
           <w:p>
             <w:pPr>
               <w:pStyle w:val="TNR"/>
             </w:pPr>
             <w:r>
-              <w:t>Need more of these timeline things</w:t>
-            </w:r>
-          </w:p>
-        </w:tc>
-        <w:tc>
-          <w:tcPr>
-            <w:tcW w:w="4701" w:type="dxa"/>
+              <w:rPr>
+                <w:rFonts w:cs="Arial"/>
+              </w:rPr>
+              <w:t>Final Panel</w:t>
+            </w:r>
+          </w:p>
+        </w:tc>
+        <w:tc>
+          <w:tcPr>
+            <w:tcW w:w="2972" w:type="dxa"/>
+            <w:shd w:val="clear" w:color="auto" w:fill="FFFFFF" w:themeFill="background1"/>
           </w:tcPr>
           <w:p>
             <w:pPr>
               <w:pStyle w:val="TNR"/>
             </w:pPr>
+            <w:r>
+              <w:rPr>
+                <w:rFonts w:cs="Arial"/>
+              </w:rPr>
+              <w:t>Week 16 or 17</w:t>
+            </w:r>
+          </w:p>
+        </w:tc>
+        <w:tc>
+          <w:tcPr>
+            <w:tcW w:w="4087" w:type="dxa"/>
+            <w:shd w:val="clear" w:color="auto" w:fill="C1E4F5" w:themeFill="accent1" w:themeFillTint="33"/>
+          </w:tcPr>
+          <w:p>
+            <w:pPr>
+              <w:pStyle w:val="TNR"/>
+              <w:rPr>
+                <w:rFonts w:cs="Arial"/>
+              </w:rPr>
+            </w:pPr>
+            <w:r>
+              <w:rPr>
+                <w:rFonts w:cs="Arial"/>
+              </w:rPr>
+              <w:t>Academic</w:t>
+            </w:r>
+          </w:p>
+        </w:tc>
+      </w:tr>
+      <w:tr>
+        <w:tc>
+          <w:tcPr>
+            <w:tcW w:w="3397" w:type="dxa"/>
+          </w:tcPr>
+          <w:p>
+            <w:pPr>
+              <w:pStyle w:val="TNR"/>
+            </w:pPr>
+          </w:p>
+        </w:tc>
+        <w:tc>
+          <w:tcPr>
+            <w:tcW w:w="2972" w:type="dxa"/>
+          </w:tcPr>
+          <w:p>
+            <w:pPr>
+              <w:pStyle w:val="TNR"/>
+            </w:pPr>
+          </w:p>
+        </w:tc>
+        <w:tc>
+          <w:tcPr>
+            <w:tcW w:w="4087" w:type="dxa"/>
+            <w:shd w:val="clear" w:color="auto" w:fill="C1E4F5" w:themeFill="accent1" w:themeFillTint="33"/>
+          </w:tcPr>
+          <w:p>
+            <w:pPr>
+              <w:pStyle w:val="TNR"/>
+            </w:pPr>
+          </w:p>
+        </w:tc>
+      </w:tr>
+      <w:tr>
+        <w:tc>
+          <w:tcPr>
+            <w:tcW w:w="3397" w:type="dxa"/>
+          </w:tcPr>
+          <w:p>
+            <w:pPr>
+              <w:pStyle w:val="TNR"/>
+            </w:pPr>
+            <w:r>
+              <w:t>Weekly logs</w:t>
+            </w:r>
+          </w:p>
+        </w:tc>
+        <w:tc>
+          <w:tcPr>
+            <w:tcW w:w="2972" w:type="dxa"/>
+          </w:tcPr>
+          <w:p>
+            <w:pPr>
+              <w:pStyle w:val="TNR"/>
+            </w:pPr>
+            <w:r>
+              <w:t>Weekly, due Wednesday 1pm</w:t>
+            </w:r>
+          </w:p>
+        </w:tc>
+        <w:tc>
+          <w:tcPr>
+            <w:tcW w:w="4087" w:type="dxa"/>
+            <w:shd w:val="clear" w:color="auto" w:fill="C1E4F5" w:themeFill="accent1" w:themeFillTint="33"/>
+          </w:tcPr>
+          <w:p>
+            <w:pPr>
+              <w:pStyle w:val="TNR"/>
+            </w:pPr>
+            <w:r>
+              <w:rPr>
+                <w:rFonts w:cs="Arial"/>
+              </w:rPr>
+              <w:t>Academic</w:t>
+            </w:r>
           </w:p>
         </w:tc>
       </w:tr>
@@ -14082,6 +14337,7 @@
               <w:pStyle w:val="TNR"/>
             </w:pPr>
             <w:r>
+              <w:lastRenderedPageBreak/>
               <w:t>R11 Tech/Vendor becomes unavailable.</w:t>
             </w:r>
           </w:p>
@@ -14096,6 +14352,7 @@
               <w:pStyle w:val="TNR"/>
             </w:pPr>
             <w:r>
+              <w:lastRenderedPageBreak/>
               <w:t xml:space="preserve">R07 Hardware stolen. </w:t>
             </w:r>
           </w:p>
@@ -14691,6 +14948,7 @@
               <w:pStyle w:val="TNR"/>
             </w:pPr>
             <w:r>
+              <w:lastRenderedPageBreak/>
               <w:t>R14 Power outage</w:t>
             </w:r>
           </w:p>
@@ -15210,6 +15468,7 @@
               <w:pStyle w:val="TNR"/>
             </w:pPr>
             <w:r>
+              <w:lastRenderedPageBreak/>
               <w:t>R13 Natural disaster or pandemic</w:t>
             </w:r>
           </w:p>
@@ -15332,7 +15591,6 @@
             <w:id w:val="-573587230"/>
             <w:bibliography/>
           </w:sdtPr>
-          <w:sdtEndPr/>
           <w:sdtContent>
             <w:p>
               <w:pPr>
@@ -15770,7 +16028,6 @@
       </w:pPr>
       <w:bookmarkStart w:id="31" w:name="_Toc238027969"/>
       <w:r>
-        <w:lastRenderedPageBreak/>
         <w:t>Appendices</w:t>
       </w:r>
       <w:bookmarkEnd w:id="31"/>
@@ -16001,7 +16258,6 @@
       </w:pPr>
       <w:bookmarkStart w:id="33" w:name="_Toc238027971"/>
       <w:r>
-        <w:lastRenderedPageBreak/>
         <w:t>Appendix B</w:t>
       </w:r>
       <w:bookmarkEnd w:id="33"/>
@@ -16380,6 +16636,7 @@
       </w:pPr>
       <w:bookmarkStart w:id="35" w:name="_Toc238027973"/>
       <w:r>
+        <w:lastRenderedPageBreak/>
         <w:t>1. Effective Date</w:t>
       </w:r>
       <w:bookmarkEnd w:id="35"/>
@@ -16459,7 +16716,6 @@
         <w:ind w:left="696" w:hanging="427"/>
       </w:pPr>
       <w:r>
-        <w:lastRenderedPageBreak/>
         <w:t xml:space="preserve">2.1 The Organisation has accepted the </w:t>
       </w:r>
       <w:proofErr w:type="gramStart"/>
@@ -16680,6 +16936,7 @@
         <w:jc w:val="both"/>
       </w:pPr>
       <w:r>
+        <w:lastRenderedPageBreak/>
         <w:t xml:space="preserve">is independently developed by the recipient party; or </w:t>
       </w:r>
     </w:p>
@@ -16743,7 +17000,6 @@
       </w:pPr>
       <w:bookmarkStart w:id="39" w:name="_Toc238027977"/>
       <w:r>
-        <w:lastRenderedPageBreak/>
         <w:t>5</w:t>
       </w:r>
       <w:r>
@@ -17722,6 +17978,7 @@
               <w:rPr>
                 <w:rFonts w:ascii="Times New Roman" w:hAnsi="Times New Roman" w:cs="Times New Roman"/>
               </w:rPr>
+              <w:lastRenderedPageBreak/>
               <w:t xml:space="preserve">Student </w:t>
             </w:r>
           </w:p>
@@ -18008,7 +18265,6 @@
       </w:pPr>
       <w:bookmarkStart w:id="41" w:name="_Toc238027979"/>
       <w:r>
-        <w:lastRenderedPageBreak/>
         <w:t>Appendix C</w:t>
       </w:r>
       <w:bookmarkEnd w:id="41"/>
@@ -18060,6 +18316,9 @@
         <w:pStyle w:val="TNR"/>
       </w:pPr>
       <w:r>
+        <w:rPr>
+          <w:noProof/>
+        </w:rPr>
         <w:drawing>
           <wp:inline distT="0" distB="0" distL="0" distR="0" wp14:anchorId="5991A923" wp14:editId="1F36DD31">
             <wp:extent cx="6645910" cy="1619250"/>
@@ -18642,7 +18901,6 @@
         <w:docPartUnique/>
       </w:docPartObj>
     </w:sdtPr>
-    <w:sdtEndPr/>
     <w:sdtContent>
       <w:p>
         <w:pPr>
@@ -20641,6 +20899,7 @@
   <w:style w:type="character" w:default="1" w:styleId="DefaultParagraphFont">
     <w:name w:val="Default Paragraph Font"/>
     <w:uiPriority w:val="1"/>
+    <w:semiHidden/>
     <w:unhideWhenUsed/>
   </w:style>
   <w:style w:type="table" w:default="1" w:styleId="TableNormal">

</xml_diff>